<commit_message>
Dynamic binding inforced in main.cpp
</commit_message>
<xml_diff>
--- a/Report/Project Report.docx
+++ b/Report/Project Report.docx
@@ -628,10 +628,10 @@
           <w:b/>
           <w:bCs/>
         </w:rPr>
-        <w:t>File I/O:</w:t>
-      </w:r>
-      <w:r>
-        <w:t xml:space="preserve"> Extensive use of &lt;fstream&gt; to bridge the gap between memory and disk storage.</w:t>
+        <w:t xml:space="preserve">Polymorphism: </w:t>
+      </w:r>
+      <w:r>
+        <w:t>A single pointer of ‘Portfolio’ type pointing to an array containing the dynamically created objects of the sub-classes, hence enforcing late binding or runtime binding.</w:t>
       </w:r>
     </w:p>
     <w:p>
@@ -646,10 +646,10 @@
           <w:b/>
           <w:bCs/>
         </w:rPr>
-        <w:t>Exception Handling:</w:t>
-      </w:r>
-      <w:r>
-        <w:t xml:space="preserve"> Implementing a centralized error-trapping system where the C++ engine communicates "disturbed structure" errors back to the UI via system exit codes.</w:t>
+        <w:t>File I/O:</w:t>
+      </w:r>
+      <w:r>
+        <w:t xml:space="preserve"> Extensive use of &lt;fstream&gt; to bridge the gap between memory and disk storage.</w:t>
       </w:r>
     </w:p>
     <w:p>
@@ -664,6 +664,24 @@
           <w:b/>
           <w:bCs/>
         </w:rPr>
+        <w:t>Exception Handling:</w:t>
+      </w:r>
+      <w:r>
+        <w:t xml:space="preserve"> Implementing a centralized error-trapping system where the C++ engine communicates "disturbed structure" errors back to the UI via system exit codes.</w:t>
+      </w:r>
+    </w:p>
+    <w:p>
+      <w:pPr>
+        <w:numPr>
+          <w:ilvl w:val="0"/>
+          <w:numId w:val="6"/>
+        </w:numPr>
+      </w:pPr>
+      <w:r>
+        <w:rPr>
+          <w:b/>
+          <w:bCs/>
+        </w:rPr>
         <w:t>String Manipulation:</w:t>
       </w:r>
       <w:r>
@@ -675,6 +693,7 @@
         <w:pStyle w:val="Heading1"/>
       </w:pPr>
       <w:r>
+        <w:lastRenderedPageBreak/>
         <w:t>List of Features</w:t>
       </w:r>
     </w:p>
@@ -690,7 +709,6 @@
           <w:b/>
           <w:bCs/>
         </w:rPr>
-        <w:lastRenderedPageBreak/>
         <w:t>Dual-Pane Workspace:</w:t>
       </w:r>
       <w:r>
@@ -797,7 +815,7 @@
           <w:noProof/>
         </w:rPr>
         <w:drawing>
-          <wp:inline distT="0" distB="0" distL="0" distR="0" wp14:anchorId="7913C2E7" wp14:editId="003E8401">
+          <wp:inline distT="0" distB="0" distL="0" distR="0" wp14:anchorId="7913C2E7" wp14:editId="032E913D">
             <wp:extent cx="2604977" cy="4251003"/>
             <wp:effectExtent l="0" t="0" r="5080" b="0"/>
             <wp:docPr id="1075472831" name="Picture 1"/>
@@ -854,7 +872,6 @@
     <w:p/>
     <w:p>
       <w:r>
-        <w:lastRenderedPageBreak/>
         <w:t>Flow Diagram of C++ Program</w:t>
       </w:r>
     </w:p>
@@ -1001,6 +1018,7 @@
           <w:b/>
           <w:bCs/>
         </w:rPr>
+        <w:lastRenderedPageBreak/>
         <w:t>Backend Logic:</w:t>
       </w:r>
       <w:r>
@@ -1032,7 +1050,6 @@
           <w:b/>
           <w:bCs/>
         </w:rPr>
-        <w:lastRenderedPageBreak/>
         <w:t>Project Management:</w:t>
       </w:r>
       <w:r>
@@ -1138,20 +1155,10 @@
           <w:b/>
           <w:bCs/>
         </w:rPr>
-        <w:t>Quality Assurance:</w:t>
-      </w:r>
-      <w:r>
-        <w:t> Implemented comprehensive </w:t>
-      </w:r>
-      <w:r>
-        <w:rPr>
-          <w:b/>
-          <w:bCs/>
-        </w:rPr>
-        <w:t>error handling</w:t>
-      </w:r>
-      <w:r>
-        <w:t> within the OOP framework.</w:t>
+        <w:t xml:space="preserve">Backend Logic: </w:t>
+      </w:r>
+      <w:r>
+        <w:t>Handled the dynamic polymorphism and completed the ‘Projects’ class.</w:t>
       </w:r>
     </w:p>
     <w:p>

</xml_diff>